<commit_message>
report: add final deliverables, commit pending book/paper updates
Adds the remaining project deliverables that were sitting untracked:
  - taoFPGA_Final_Presentation.pdf / .pptx  (final defense deck)
  - First_Project_Report_Group_309.pdf     (midterm report)
  - generate_final_presentation.py          (its generator)
  - manim/scene_taofpga.py                  (3B1B-style overview animation)
  - figures/fig_vit_sample_samoyed.jpg, figures/fig_vivado_device.png

Also folds in pending working-tree edits to the Project Book / IEEE
paper generators and their rendered .docx/.pdf, the refreshed SimVision
screenshots, and drops the stray root-level simvision_waveform_zoom.pdf
(the copy under report/figures/ is the one referenced).

Co-Authored-By: Claude Sonnet 5 <noreply@anthropic.com>
</commit_message>
<xml_diff>
--- a/report/taoFPGA_IEEE_paper.docx
+++ b/report/taoFPGA_IEEE_paper.docx
@@ -1794,10 +1794,10 @@
       </w:tblPr>
       <w:tblGrid>
         <w:gridCol w:w="648"/>
-        <w:gridCol w:w="1656"/>
-        <w:gridCol w:w="792"/>
-        <w:gridCol w:w="504"/>
-        <w:gridCol w:w="1512"/>
+        <w:gridCol w:w="1584"/>
+        <w:gridCol w:w="576"/>
+        <w:gridCol w:w="432"/>
+        <w:gridCol w:w="1872"/>
       </w:tblGrid>
       <w:tr>
         <w:trPr>
@@ -1831,7 +1831,7 @@
         </w:tc>
         <w:tc>
           <w:tcPr>
-            <w:tcW w:type="dxa" w:w="1656"/>
+            <w:tcW w:type="dxa" w:w="1584"/>
             <w:tcBorders>
               <w:top w:val="single" w:sz="8" w:space="0" w:color="0B0B0B"/>
               <w:bottom w:val="single" w:sz="6" w:space="0" w:color="0B0B0B"/>
@@ -1857,7 +1857,7 @@
         </w:tc>
         <w:tc>
           <w:tcPr>
-            <w:tcW w:type="dxa" w:w="792"/>
+            <w:tcW w:type="dxa" w:w="576"/>
             <w:tcBorders>
               <w:top w:val="single" w:sz="8" w:space="0" w:color="0B0B0B"/>
               <w:bottom w:val="single" w:sz="6" w:space="0" w:color="0B0B0B"/>
@@ -1883,7 +1883,7 @@
         </w:tc>
         <w:tc>
           <w:tcPr>
-            <w:tcW w:type="dxa" w:w="504"/>
+            <w:tcW w:type="dxa" w:w="432"/>
             <w:tcBorders>
               <w:top w:val="single" w:sz="8" w:space="0" w:color="0B0B0B"/>
               <w:bottom w:val="single" w:sz="6" w:space="0" w:color="0B0B0B"/>
@@ -1909,7 +1909,7 @@
         </w:tc>
         <w:tc>
           <w:tcPr>
-            <w:tcW w:type="dxa" w:w="1512"/>
+            <w:tcW w:type="dxa" w:w="1872"/>
             <w:tcBorders>
               <w:top w:val="single" w:sz="8" w:space="0" w:color="0B0B0B"/>
               <w:bottom w:val="single" w:sz="6" w:space="0" w:color="0B0B0B"/>
@@ -1966,7 +1966,7 @@
         </w:tc>
         <w:tc>
           <w:tcPr>
-            <w:tcW w:type="dxa" w:w="1656"/>
+            <w:tcW w:type="dxa" w:w="1584"/>
             <w:tcBorders>
               <w:top w:val="nil"/>
               <w:bottom w:val="nil"/>
@@ -1992,7 +1992,7 @@
         </w:tc>
         <w:tc>
           <w:tcPr>
-            <w:tcW w:type="dxa" w:w="792"/>
+            <w:tcW w:type="dxa" w:w="576"/>
             <w:tcBorders>
               <w:top w:val="nil"/>
               <w:bottom w:val="nil"/>
@@ -2018,7 +2018,7 @@
         </w:tc>
         <w:tc>
           <w:tcPr>
-            <w:tcW w:type="dxa" w:w="504"/>
+            <w:tcW w:type="dxa" w:w="432"/>
             <w:tcBorders>
               <w:top w:val="nil"/>
               <w:bottom w:val="nil"/>
@@ -2044,7 +2044,7 @@
         </w:tc>
         <w:tc>
           <w:tcPr>
-            <w:tcW w:type="dxa" w:w="1512"/>
+            <w:tcW w:type="dxa" w:w="1872"/>
             <w:tcBorders>
               <w:top w:val="nil"/>
               <w:bottom w:val="nil"/>
@@ -2101,7 +2101,7 @@
         </w:tc>
         <w:tc>
           <w:tcPr>
-            <w:tcW w:type="dxa" w:w="1656"/>
+            <w:tcW w:type="dxa" w:w="1584"/>
             <w:tcBorders>
               <w:top w:val="nil"/>
               <w:bottom w:val="nil"/>
@@ -2127,7 +2127,7 @@
         </w:tc>
         <w:tc>
           <w:tcPr>
-            <w:tcW w:type="dxa" w:w="792"/>
+            <w:tcW w:type="dxa" w:w="576"/>
             <w:tcBorders>
               <w:top w:val="nil"/>
               <w:bottom w:val="nil"/>
@@ -2153,7 +2153,7 @@
         </w:tc>
         <w:tc>
           <w:tcPr>
-            <w:tcW w:type="dxa" w:w="504"/>
+            <w:tcW w:type="dxa" w:w="432"/>
             <w:tcBorders>
               <w:top w:val="nil"/>
               <w:bottom w:val="nil"/>
@@ -2179,7 +2179,7 @@
         </w:tc>
         <w:tc>
           <w:tcPr>
-            <w:tcW w:type="dxa" w:w="1512"/>
+            <w:tcW w:type="dxa" w:w="1872"/>
             <w:tcBorders>
               <w:top w:val="nil"/>
               <w:bottom w:val="nil"/>
@@ -2236,7 +2236,7 @@
         </w:tc>
         <w:tc>
           <w:tcPr>
-            <w:tcW w:type="dxa" w:w="1656"/>
+            <w:tcW w:type="dxa" w:w="1584"/>
             <w:tcBorders>
               <w:top w:val="nil"/>
               <w:bottom w:val="nil"/>
@@ -2262,7 +2262,7 @@
         </w:tc>
         <w:tc>
           <w:tcPr>
-            <w:tcW w:type="dxa" w:w="792"/>
+            <w:tcW w:type="dxa" w:w="576"/>
             <w:tcBorders>
               <w:top w:val="nil"/>
               <w:bottom w:val="nil"/>
@@ -2288,7 +2288,7 @@
         </w:tc>
         <w:tc>
           <w:tcPr>
-            <w:tcW w:type="dxa" w:w="504"/>
+            <w:tcW w:type="dxa" w:w="432"/>
             <w:tcBorders>
               <w:top w:val="nil"/>
               <w:bottom w:val="nil"/>
@@ -2314,7 +2314,7 @@
         </w:tc>
         <w:tc>
           <w:tcPr>
-            <w:tcW w:type="dxa" w:w="1512"/>
+            <w:tcW w:type="dxa" w:w="1872"/>
             <w:tcBorders>
               <w:top w:val="nil"/>
               <w:bottom w:val="nil"/>
@@ -2371,7 +2371,7 @@
         </w:tc>
         <w:tc>
           <w:tcPr>
-            <w:tcW w:type="dxa" w:w="1656"/>
+            <w:tcW w:type="dxa" w:w="1584"/>
             <w:tcBorders>
               <w:top w:val="nil"/>
               <w:bottom w:val="nil"/>
@@ -2397,7 +2397,7 @@
         </w:tc>
         <w:tc>
           <w:tcPr>
-            <w:tcW w:type="dxa" w:w="792"/>
+            <w:tcW w:type="dxa" w:w="576"/>
             <w:tcBorders>
               <w:top w:val="nil"/>
               <w:bottom w:val="nil"/>
@@ -2423,7 +2423,7 @@
         </w:tc>
         <w:tc>
           <w:tcPr>
-            <w:tcW w:type="dxa" w:w="504"/>
+            <w:tcW w:type="dxa" w:w="432"/>
             <w:tcBorders>
               <w:top w:val="nil"/>
               <w:bottom w:val="nil"/>
@@ -2449,7 +2449,7 @@
         </w:tc>
         <w:tc>
           <w:tcPr>
-            <w:tcW w:type="dxa" w:w="1512"/>
+            <w:tcW w:type="dxa" w:w="1872"/>
             <w:tcBorders>
               <w:top w:val="nil"/>
               <w:bottom w:val="nil"/>
@@ -2506,7 +2506,7 @@
         </w:tc>
         <w:tc>
           <w:tcPr>
-            <w:tcW w:type="dxa" w:w="1656"/>
+            <w:tcW w:type="dxa" w:w="1584"/>
             <w:tcBorders>
               <w:top w:val="nil"/>
               <w:bottom w:val="nil"/>
@@ -2532,7 +2532,7 @@
         </w:tc>
         <w:tc>
           <w:tcPr>
-            <w:tcW w:type="dxa" w:w="792"/>
+            <w:tcW w:type="dxa" w:w="576"/>
             <w:tcBorders>
               <w:top w:val="nil"/>
               <w:bottom w:val="nil"/>
@@ -2558,7 +2558,7 @@
         </w:tc>
         <w:tc>
           <w:tcPr>
-            <w:tcW w:type="dxa" w:w="504"/>
+            <w:tcW w:type="dxa" w:w="432"/>
             <w:tcBorders>
               <w:top w:val="nil"/>
               <w:bottom w:val="nil"/>
@@ -2584,7 +2584,7 @@
         </w:tc>
         <w:tc>
           <w:tcPr>
-            <w:tcW w:type="dxa" w:w="1512"/>
+            <w:tcW w:type="dxa" w:w="1872"/>
             <w:tcBorders>
               <w:top w:val="nil"/>
               <w:bottom w:val="nil"/>
@@ -2641,7 +2641,7 @@
         </w:tc>
         <w:tc>
           <w:tcPr>
-            <w:tcW w:type="dxa" w:w="1656"/>
+            <w:tcW w:type="dxa" w:w="1584"/>
             <w:tcBorders>
               <w:top w:val="nil"/>
               <w:bottom w:val="nil"/>
@@ -2667,7 +2667,7 @@
         </w:tc>
         <w:tc>
           <w:tcPr>
-            <w:tcW w:type="dxa" w:w="792"/>
+            <w:tcW w:type="dxa" w:w="576"/>
             <w:tcBorders>
               <w:top w:val="nil"/>
               <w:bottom w:val="nil"/>
@@ -2693,7 +2693,7 @@
         </w:tc>
         <w:tc>
           <w:tcPr>
-            <w:tcW w:type="dxa" w:w="504"/>
+            <w:tcW w:type="dxa" w:w="432"/>
             <w:tcBorders>
               <w:top w:val="nil"/>
               <w:bottom w:val="nil"/>
@@ -2719,7 +2719,7 @@
         </w:tc>
         <w:tc>
           <w:tcPr>
-            <w:tcW w:type="dxa" w:w="1512"/>
+            <w:tcW w:type="dxa" w:w="1872"/>
             <w:tcBorders>
               <w:top w:val="nil"/>
               <w:bottom w:val="nil"/>
@@ -2776,7 +2776,7 @@
         </w:tc>
         <w:tc>
           <w:tcPr>
-            <w:tcW w:type="dxa" w:w="1656"/>
+            <w:tcW w:type="dxa" w:w="1584"/>
             <w:tcBorders>
               <w:top w:val="nil"/>
               <w:bottom w:val="nil"/>
@@ -2802,7 +2802,7 @@
         </w:tc>
         <w:tc>
           <w:tcPr>
-            <w:tcW w:type="dxa" w:w="792"/>
+            <w:tcW w:type="dxa" w:w="576"/>
             <w:tcBorders>
               <w:top w:val="nil"/>
               <w:bottom w:val="nil"/>
@@ -2828,7 +2828,7 @@
         </w:tc>
         <w:tc>
           <w:tcPr>
-            <w:tcW w:type="dxa" w:w="504"/>
+            <w:tcW w:type="dxa" w:w="432"/>
             <w:tcBorders>
               <w:top w:val="nil"/>
               <w:bottom w:val="nil"/>
@@ -2854,7 +2854,7 @@
         </w:tc>
         <w:tc>
           <w:tcPr>
-            <w:tcW w:type="dxa" w:w="1512"/>
+            <w:tcW w:type="dxa" w:w="1872"/>
             <w:tcBorders>
               <w:top w:val="nil"/>
               <w:bottom w:val="nil"/>
@@ -2911,7 +2911,7 @@
         </w:tc>
         <w:tc>
           <w:tcPr>
-            <w:tcW w:type="dxa" w:w="1656"/>
+            <w:tcW w:type="dxa" w:w="1584"/>
             <w:tcBorders>
               <w:top w:val="nil"/>
               <w:bottom w:val="single" w:sz="8" w:space="0" w:color="0B0B0B"/>
@@ -2937,7 +2937,7 @@
         </w:tc>
         <w:tc>
           <w:tcPr>
-            <w:tcW w:type="dxa" w:w="792"/>
+            <w:tcW w:type="dxa" w:w="576"/>
             <w:tcBorders>
               <w:top w:val="nil"/>
               <w:bottom w:val="single" w:sz="8" w:space="0" w:color="0B0B0B"/>
@@ -2963,7 +2963,7 @@
         </w:tc>
         <w:tc>
           <w:tcPr>
-            <w:tcW w:type="dxa" w:w="504"/>
+            <w:tcW w:type="dxa" w:w="432"/>
             <w:tcBorders>
               <w:top w:val="nil"/>
               <w:bottom w:val="single" w:sz="8" w:space="0" w:color="0B0B0B"/>
@@ -2989,7 +2989,7 @@
         </w:tc>
         <w:tc>
           <w:tcPr>
-            <w:tcW w:type="dxa" w:w="1512"/>
+            <w:tcW w:type="dxa" w:w="1872"/>
             <w:tcBorders>
               <w:top w:val="nil"/>
               <w:bottom w:val="single" w:sz="8" w:space="0" w:color="0B0B0B"/>
@@ -3009,7 +3009,7 @@
                 <w:i w:val="0"/>
                 <w:sz w:val="17"/>
               </w:rPr>
-              <w:t>bit0 = softmax_to_gelu_fifo_overflow (live, not latched)</w:t>
+              <w:t>bit0 = softmax_​to_​gelu_​fifo_​overflow (live, not latched)</w:t>
             </w:r>
           </w:p>
         </w:tc>
@@ -4226,7 +4226,7 @@
           <w:i w:val="0"/>
           <w:sz w:val="20"/>
         </w:rPr>
-        <w:t>The hardware kernel achieved 2.487 GOP/s and 3.795 GOP/s on the two benchmarked shapes respectively, against 0.036 and 0.039 GOP/s on the CPU — measured speedups of 70.02× and 97.73× for the identical operation. At the 3.795 GOP/s peak (192×320, MLP-shaped kernel), against the post-route signoff power figures of Table II (1.687 W total on-chip, 1.538 W dynamic), the design achieves a total energy efficiency of 2.25 GOPS/W and a dynamic energy efficiency of 2.47 GOPS/W. These efficiency figures combine a live-measured kernel throughput with Vivado's post-route, activity-based power estimate for the full SoC design — not a physically instrumented power reading synchronized to the benchmark run itself — and should be read as a signoff-grade estimate accordingly. Figs. 5–7 present latency, throughput, and speedup for both shapes.</w:t>
+        <w:t>The hardware kernel delivers a 70.02×–97.73× speedup over the CPU baseline across both benchmarked shapes, detailed latency-by-shape in Table III and visualized in Figs. 5–7. At its 3.795 GOP/s peak (192×320, MLP-shaped kernel), against the post-route signoff power figures of Table II (1.687 W total on-chip, 1.538 W dynamic), the design achieves a total energy efficiency of 2.25 GOPS/W and a dynamic energy efficiency of 2.47 GOPS/W. These efficiency figures combine a live-measured kernel throughput with Vivado's post-route, activity-based power estimate for the full SoC design — not a physically instrumented power reading synchronized to the benchmark run itself — and should be read as a signoff-grade estimate accordingly.</w:t>
       </w:r>
     </w:p>
     <w:p>
@@ -4946,14 +4946,15 @@
     <w:tbl>
       <w:tblPr>
         <w:tblW w:type="auto" w:w="0"/>
+        <w:tblLayout w:type="fixed"/>
         <w:tblLook w:firstColumn="1" w:firstRow="1" w:lastColumn="0" w:lastRow="0" w:noHBand="0" w:noVBand="1" w:val="04A0"/>
       </w:tblPr>
       <w:tblGrid>
-        <w:gridCol w:w="2108"/>
-        <w:gridCol w:w="2108"/>
-        <w:gridCol w:w="2108"/>
-        <w:gridCol w:w="2108"/>
-        <w:gridCol w:w="2108"/>
+        <w:gridCol w:w="893"/>
+        <w:gridCol w:w="864"/>
+        <w:gridCol w:w="1080"/>
+        <w:gridCol w:w="936"/>
+        <w:gridCol w:w="1267"/>
       </w:tblGrid>
       <w:tr>
         <w:trPr>
@@ -4961,7 +4962,7 @@
         </w:trPr>
         <w:tc>
           <w:tcPr>
-            <w:tcW w:type="dxa" w:w="2108"/>
+            <w:tcW w:type="dxa" w:w="893"/>
             <w:tcBorders>
               <w:top w:val="single" w:sz="8" w:space="0" w:color="0B0B0B"/>
               <w:bottom w:val="single" w:sz="6" w:space="0" w:color="0B0B0B"/>
@@ -4987,7 +4988,7 @@
         </w:tc>
         <w:tc>
           <w:tcPr>
-            <w:tcW w:type="dxa" w:w="2108"/>
+            <w:tcW w:type="dxa" w:w="864"/>
             <w:tcBorders>
               <w:top w:val="single" w:sz="8" w:space="0" w:color="0B0B0B"/>
               <w:bottom w:val="single" w:sz="6" w:space="0" w:color="0B0B0B"/>
@@ -5013,7 +5014,7 @@
         </w:tc>
         <w:tc>
           <w:tcPr>
-            <w:tcW w:type="dxa" w:w="2108"/>
+            <w:tcW w:type="dxa" w:w="1080"/>
             <w:tcBorders>
               <w:top w:val="single" w:sz="8" w:space="0" w:color="0B0B0B"/>
               <w:bottom w:val="single" w:sz="6" w:space="0" w:color="0B0B0B"/>
@@ -5039,7 +5040,7 @@
         </w:tc>
         <w:tc>
           <w:tcPr>
-            <w:tcW w:type="dxa" w:w="2108"/>
+            <w:tcW w:type="dxa" w:w="936"/>
             <w:tcBorders>
               <w:top w:val="single" w:sz="8" w:space="0" w:color="0B0B0B"/>
               <w:bottom w:val="single" w:sz="6" w:space="0" w:color="0B0B0B"/>
@@ -5059,13 +5060,13 @@
                 <w:i w:val="0"/>
                 <w:sz w:val="17"/>
               </w:rPr>
-              <w:t>DSP utilization</w:t>
+              <w:t>DSP Util.</w:t>
             </w:r>
           </w:p>
         </w:tc>
         <w:tc>
           <w:tcPr>
-            <w:tcW w:type="dxa" w:w="2108"/>
+            <w:tcW w:type="dxa" w:w="1267"/>
             <w:tcBorders>
               <w:top w:val="single" w:sz="8" w:space="0" w:color="0B0B0B"/>
               <w:bottom w:val="single" w:sz="6" w:space="0" w:color="0B0B0B"/>
@@ -5096,7 +5097,7 @@
         </w:trPr>
         <w:tc>
           <w:tcPr>
-            <w:tcW w:type="dxa" w:w="2108"/>
+            <w:tcW w:type="dxa" w:w="893"/>
             <w:tcBorders>
               <w:top w:val="nil"/>
               <w:bottom w:val="nil"/>
@@ -5122,7 +5123,7 @@
         </w:tc>
         <w:tc>
           <w:tcPr>
-            <w:tcW w:type="dxa" w:w="2108"/>
+            <w:tcW w:type="dxa" w:w="864"/>
             <w:tcBorders>
               <w:top w:val="nil"/>
               <w:bottom w:val="nil"/>
@@ -5148,7 +5149,7 @@
         </w:tc>
         <w:tc>
           <w:tcPr>
-            <w:tcW w:type="dxa" w:w="2108"/>
+            <w:tcW w:type="dxa" w:w="1080"/>
             <w:tcBorders>
               <w:top w:val="nil"/>
               <w:bottom w:val="nil"/>
@@ -5174,7 +5175,7 @@
         </w:tc>
         <w:tc>
           <w:tcPr>
-            <w:tcW w:type="dxa" w:w="2108"/>
+            <w:tcW w:type="dxa" w:w="936"/>
             <w:tcBorders>
               <w:top w:val="nil"/>
               <w:bottom w:val="nil"/>
@@ -5200,7 +5201,7 @@
         </w:tc>
         <w:tc>
           <w:tcPr>
-            <w:tcW w:type="dxa" w:w="2108"/>
+            <w:tcW w:type="dxa" w:w="1267"/>
             <w:tcBorders>
               <w:top w:val="nil"/>
               <w:bottom w:val="nil"/>
@@ -5231,7 +5232,7 @@
         </w:trPr>
         <w:tc>
           <w:tcPr>
-            <w:tcW w:type="dxa" w:w="2108"/>
+            <w:tcW w:type="dxa" w:w="893"/>
             <w:tcBorders>
               <w:top w:val="nil"/>
               <w:bottom w:val="nil"/>
@@ -5257,7 +5258,7 @@
         </w:tc>
         <w:tc>
           <w:tcPr>
-            <w:tcW w:type="dxa" w:w="2108"/>
+            <w:tcW w:type="dxa" w:w="864"/>
             <w:tcBorders>
               <w:top w:val="nil"/>
               <w:bottom w:val="nil"/>
@@ -5283,7 +5284,7 @@
         </w:tc>
         <w:tc>
           <w:tcPr>
-            <w:tcW w:type="dxa" w:w="2108"/>
+            <w:tcW w:type="dxa" w:w="1080"/>
             <w:tcBorders>
               <w:top w:val="nil"/>
               <w:bottom w:val="nil"/>
@@ -5309,7 +5310,7 @@
         </w:tc>
         <w:tc>
           <w:tcPr>
-            <w:tcW w:type="dxa" w:w="2108"/>
+            <w:tcW w:type="dxa" w:w="936"/>
             <w:tcBorders>
               <w:top w:val="nil"/>
               <w:bottom w:val="nil"/>
@@ -5335,7 +5336,7 @@
         </w:tc>
         <w:tc>
           <w:tcPr>
-            <w:tcW w:type="dxa" w:w="2108"/>
+            <w:tcW w:type="dxa" w:w="1267"/>
             <w:tcBorders>
               <w:top w:val="nil"/>
               <w:bottom w:val="nil"/>
@@ -5366,7 +5367,7 @@
         </w:trPr>
         <w:tc>
           <w:tcPr>
-            <w:tcW w:type="dxa" w:w="2108"/>
+            <w:tcW w:type="dxa" w:w="893"/>
             <w:tcBorders>
               <w:top w:val="nil"/>
               <w:bottom w:val="single" w:sz="8" w:space="0" w:color="0B0B0B"/>
@@ -5392,7 +5393,7 @@
         </w:tc>
         <w:tc>
           <w:tcPr>
-            <w:tcW w:type="dxa" w:w="2108"/>
+            <w:tcW w:type="dxa" w:w="864"/>
             <w:tcBorders>
               <w:top w:val="nil"/>
               <w:bottom w:val="single" w:sz="8" w:space="0" w:color="0B0B0B"/>
@@ -5418,7 +5419,7 @@
         </w:tc>
         <w:tc>
           <w:tcPr>
-            <w:tcW w:type="dxa" w:w="2108"/>
+            <w:tcW w:type="dxa" w:w="1080"/>
             <w:tcBorders>
               <w:top w:val="nil"/>
               <w:bottom w:val="single" w:sz="8" w:space="0" w:color="0B0B0B"/>
@@ -5444,7 +5445,7 @@
         </w:tc>
         <w:tc>
           <w:tcPr>
-            <w:tcW w:type="dxa" w:w="2108"/>
+            <w:tcW w:type="dxa" w:w="936"/>
             <w:tcBorders>
               <w:top w:val="nil"/>
               <w:bottom w:val="single" w:sz="8" w:space="0" w:color="0B0B0B"/>
@@ -5470,7 +5471,7 @@
         </w:tc>
         <w:tc>
           <w:tcPr>
-            <w:tcW w:type="dxa" w:w="2108"/>
+            <w:tcW w:type="dxa" w:w="1267"/>
             <w:tcBorders>
               <w:top w:val="nil"/>
               <w:bottom w:val="single" w:sz="8" w:space="0" w:color="0B0B0B"/>

</xml_diff>